<commit_message>
Documentation for the final-clean layer
- docs/FINAL-DATASET-METHOD.md: routing principle (parse artifacts fixed
  upstream, print errors resolved downstream), rule catalogue with argued
  justifications, three worked examples, confidence rubric, register
  workflow, pipeline integration.
- REPLICATION.md: steps 5-6, hazards H22-H25 (heading-swallow classes and
  fee-format grammar), final-layer multi-year status table.
- USER-MANUAL.md + regenerated Word copy: two-layer guidance (analysts use
  final tables), sections 6.4/6.5, updated validation results, corrections
  workflow now routed via the adjudication register.
- README/CLAUDE.md: 6-step pipeline, final-layer quality table, ground rule
  that print errors are only ever resolved via resolutions/com.csv.

Co-Authored-By: Claude Fable 5 <noreply@anthropic.com>
</commit_message>
<xml_diff>
--- a/docs/UCT-Handbook-Dataset-User-Manual.docx
+++ b/docs/UCT-Handbook-Dataset-User-Manual.docx
@@ -565,7 +565,40 @@
           <w:sz w:val="22"/>
           <w:szCs w:val="22"/>
         </w:rPr>
-        <w:t xml:space="preserve">The 2025 edition is treated as the baseline — the recorded state of the curriculum against which the credit re-think editions are compared. Across the six Commerce editions the dataset holds 14,282 curriculum records covering roughly 70 specialisations per year (69–73, as offerings opened and closed), including the Academic Development (augmented and extended) variants and the Advanced Diplomas.</w:t>
+        <w:t xml:space="preserve">The 2025 edition is treated as the baseline — the recorded state of the curriculum against which the credit re-think editions are compared. Across the six Commerce editions the dataset holds 14,282 curriculum records covering 71–75 specialisations per year as offerings opened and closed, including the Academic Development (augmented and extended) variants and the Advanced Diplomas.</w:t>
+      </w:r>
+    </w:p>
+    <w:p>
+      <w:pPr>
+        <w:spacing w:after="160" w:line="276"/>
+      </w:pPr>
+      <w:r>
+        <w:rPr>
+          <w:sz w:val="22"/>
+          <w:szCs w:val="22"/>
+        </w:rPr>
+        <w:t xml:space="preserve">The dataset comes in two layers: the as-printed layer — exactly what the handbooks print, including their own defects, preserved for audit — and the final-clean layer (main_dataset_final.csv, ideal_student_summary_final.csv) — the same data with those defects resolved by documented, justified rules and case-by-case adjudications.</w:t>
+      </w:r>
+    </w:p>
+    <w:p>
+      <w:pPr>
+        <w:spacing w:after="160" w:line="276"/>
+      </w:pPr>
+      <w:r>
+        <w:rPr>
+          <w:b/>
+          <w:bCs/>
+          <w:sz w:val="22"/>
+          <w:szCs w:val="22"/>
+        </w:rPr>
+        <w:t xml:space="preserve">Analysts should use the final-clean tables; auditors and replicators the as-printed ones. </w:t>
+      </w:r>
+      <w:r>
+        <w:rPr>
+          <w:sz w:val="22"/>
+          <w:szCs w:val="22"/>
+        </w:rPr>
+        <w:t xml:space="preserve">Section 6 describes both.</w:t>
       </w:r>
     </w:p>
     <w:p>
@@ -2466,18 +2499,18 @@
     </w:p>
     <w:p>
       <w:pPr>
-        <w:pStyle w:val="Heading1"/>
-        <w:spacing w:after="200" w:before="360"/>
+        <w:pStyle w:val="Heading2"/>
+        <w:spacing w:after="160" w:before="280"/>
       </w:pPr>
       <w:r>
         <w:rPr>
           <w:b/>
           <w:bCs/>
           <w:color w:val="1F4E79"/>
-          <w:sz w:val="30"/>
-          <w:szCs w:val="30"/>
-        </w:rPr>
-        <w:t xml:space="preserve">7. How the data is validated</w:t>
+          <w:sz w:val="25"/>
+          <w:szCs w:val="25"/>
+        </w:rPr>
+        <w:t xml:space="preserve">6.4  main_dataset_final.csv — the final-clean dataset</w:t>
       </w:r>
     </w:p>
     <w:p>
@@ -2489,7 +2522,7 @@
           <w:sz w:val="22"/>
           <w:szCs w:val="22"/>
         </w:rPr>
-        <w:t xml:space="preserve">Each specialisation-year is checked from two independent directions — a validation triangle. The curriculum (courses and credits) priced with the course-fee table gives a computed year cost; the credits are compared with the handbook's printed “Total credits per year”, and the cost with the fees book's published typical fee for that programme-year.</w:t>
+        <w:t xml:space="preserve">Every row of main_dataset.csv with its original columns untouched, plus:</w:t>
       </w:r>
     </w:p>
     <w:tbl>
@@ -2505,9 +2538,8 @@
         </w:tblBorders>
       </w:tblPr>
       <w:tblGrid>
-        <w:gridCol w:w="1805"/>
-        <w:gridCol w:w="3610"/>
-        <w:gridCol w:w="3610"/>
+        <w:gridCol w:w="3159"/>
+        <w:gridCol w:w="5867"/>
       </w:tblGrid>
       <w:tr>
         <w:trPr>
@@ -2515,7 +2547,7 @@
         </w:trPr>
         <w:tc>
           <w:tcPr>
-            <w:tcW w:type="dxa" w:w="1805"/>
+            <w:tcW w:type="dxa" w:w="3159"/>
             <w:shd w:fill="1F4E79" w:val="clear"/>
             <w:tcMar>
               <w:top w:type="dxa" w:w="60"/>
@@ -2536,13 +2568,13 @@
                 <w:sz w:val="19"/>
                 <w:szCs w:val="19"/>
               </w:rPr>
-              <w:t xml:space="preserve">Year</w:t>
-            </w:r>
-          </w:p>
-        </w:tc>
-        <w:tc>
-          <w:tcPr>
-            <w:tcW w:type="dxa" w:w="3610"/>
+              <w:t xml:space="preserve">Column</w:t>
+            </w:r>
+          </w:p>
+        </w:tc>
+        <w:tc>
+          <w:tcPr>
+            <w:tcW w:type="dxa" w:w="5867"/>
             <w:shd w:fill="1F4E79" w:val="clear"/>
             <w:tcMar>
               <w:top w:type="dxa" w:w="60"/>
@@ -2563,13 +2595,284 @@
                 <w:sz w:val="19"/>
                 <w:szCs w:val="19"/>
               </w:rPr>
-              <w:t xml:space="preserve">Credit check OK</w:t>
-            </w:r>
-          </w:p>
-        </w:tc>
-        <w:tc>
-          <w:tcPr>
-            <w:tcW w:type="dxa" w:w="3610"/>
+              <w:t xml:space="preserve">Meaning</w:t>
+            </w:r>
+          </w:p>
+        </w:tc>
+      </w:tr>
+      <w:tr>
+        <w:tc>
+          <w:tcPr>
+            <w:tcW w:type="dxa" w:w="3159"/>
+            <w:tcMar>
+              <w:top w:type="dxa" w:w="60"/>
+              <w:left w:type="dxa" w:w="100"/>
+              <w:bottom w:type="dxa" w:w="60"/>
+              <w:right w:type="dxa" w:w="100"/>
+            </w:tcMar>
+          </w:tcPr>
+          <w:p>
+            <w:pPr>
+              <w:spacing w:after="0" w:line="252"/>
+            </w:pPr>
+            <w:r>
+              <w:rPr>
+                <w:b w:val="false"/>
+                <w:bCs w:val="false"/>
+                <w:color w:val="000000"/>
+                <w:sz w:val="19"/>
+                <w:szCs w:val="19"/>
+              </w:rPr>
+              <w:t xml:space="preserve">final_included</w:t>
+            </w:r>
+          </w:p>
+        </w:tc>
+        <w:tc>
+          <w:tcPr>
+            <w:tcW w:type="dxa" w:w="5867"/>
+            <w:tcMar>
+              <w:top w:type="dxa" w:w="60"/>
+              <w:left w:type="dxa" w:w="100"/>
+              <w:bottom w:type="dxa" w:w="60"/>
+              <w:right w:type="dxa" w:w="100"/>
+            </w:tcMar>
+          </w:tcPr>
+          <w:p>
+            <w:pPr>
+              <w:spacing w:after="0" w:line="252"/>
+            </w:pPr>
+            <w:r>
+              <w:rPr>
+                <w:b w:val="false"/>
+                <w:bCs w:val="false"/>
+                <w:color w:val="000000"/>
+                <w:sz w:val="19"/>
+                <w:szCs w:val="19"/>
+              </w:rPr>
+              <w:t xml:space="preserve">True if the row counts in the final ideal-student selection (differs from ideal_student only where an adjudication changed a choice)</w:t>
+            </w:r>
+          </w:p>
+        </w:tc>
+      </w:tr>
+      <w:tr>
+        <w:tc>
+          <w:tcPr>
+            <w:tcW w:type="dxa" w:w="3159"/>
+            <w:tcMar>
+              <w:top w:type="dxa" w:w="60"/>
+              <w:left w:type="dxa" w:w="100"/>
+              <w:bottom w:type="dxa" w:w="60"/>
+              <w:right w:type="dxa" w:w="100"/>
+            </w:tcMar>
+          </w:tcPr>
+          <w:p>
+            <w:pPr>
+              <w:spacing w:after="0" w:line="252"/>
+            </w:pPr>
+            <w:r>
+              <w:rPr>
+                <w:b w:val="false"/>
+                <w:bCs w:val="false"/>
+                <w:color w:val="000000"/>
+                <w:sz w:val="19"/>
+                <w:szCs w:val="19"/>
+              </w:rPr>
+              <w:t xml:space="preserve">resolution_class</w:t>
+            </w:r>
+          </w:p>
+        </w:tc>
+        <w:tc>
+          <w:tcPr>
+            <w:tcW w:type="dxa" w:w="5867"/>
+            <w:tcMar>
+              <w:top w:type="dxa" w:w="60"/>
+              <w:left w:type="dxa" w:w="100"/>
+              <w:bottom w:type="dxa" w:w="60"/>
+              <w:right w:type="dxa" w:w="100"/>
+            </w:tcMar>
+          </w:tcPr>
+          <w:p>
+            <w:pPr>
+              <w:spacing w:after="0" w:line="252"/>
+            </w:pPr>
+            <w:r>
+              <w:rPr>
+                <w:b w:val="false"/>
+                <w:bCs w:val="false"/>
+                <w:color w:val="000000"/>
+                <w:sz w:val="19"/>
+                <w:szCs w:val="19"/>
+              </w:rPr>
+              <w:t xml:space="preserve">none / R1a (arithmetic rule) / R2a (cross-edition rule) / R3 (adjudication)</w:t>
+            </w:r>
+          </w:p>
+        </w:tc>
+      </w:tr>
+      <w:tr>
+        <w:tc>
+          <w:tcPr>
+            <w:tcW w:type="dxa" w:w="3159"/>
+            <w:tcMar>
+              <w:top w:type="dxa" w:w="60"/>
+              <w:left w:type="dxa" w:w="100"/>
+              <w:bottom w:type="dxa" w:w="60"/>
+              <w:right w:type="dxa" w:w="100"/>
+            </w:tcMar>
+          </w:tcPr>
+          <w:p>
+            <w:pPr>
+              <w:spacing w:after="0" w:line="252"/>
+            </w:pPr>
+            <w:r>
+              <w:rPr>
+                <w:b w:val="false"/>
+                <w:bCs w:val="false"/>
+                <w:color w:val="000000"/>
+                <w:sz w:val="19"/>
+                <w:szCs w:val="19"/>
+              </w:rPr>
+              <w:t xml:space="preserve">resolution_ref</w:t>
+            </w:r>
+          </w:p>
+        </w:tc>
+        <w:tc>
+          <w:tcPr>
+            <w:tcW w:type="dxa" w:w="5867"/>
+            <w:tcMar>
+              <w:top w:type="dxa" w:w="60"/>
+              <w:left w:type="dxa" w:w="100"/>
+              <w:bottom w:type="dxa" w:w="60"/>
+              <w:right w:type="dxa" w:w="100"/>
+            </w:tcMar>
+          </w:tcPr>
+          <w:p>
+            <w:pPr>
+              <w:spacing w:after="0" w:line="252"/>
+            </w:pPr>
+            <w:r>
+              <w:rPr>
+                <w:b w:val="false"/>
+                <w:bCs w:val="false"/>
+                <w:color w:val="000000"/>
+                <w:sz w:val="19"/>
+                <w:szCs w:val="19"/>
+              </w:rPr>
+              <w:t xml:space="preserve">the rule or register entry (e.g. COM-2025-008) that applied</w:t>
+            </w:r>
+          </w:p>
+        </w:tc>
+      </w:tr>
+      <w:tr>
+        <w:tc>
+          <w:tcPr>
+            <w:tcW w:type="dxa" w:w="3159"/>
+            <w:tcMar>
+              <w:top w:type="dxa" w:w="60"/>
+              <w:left w:type="dxa" w:w="100"/>
+              <w:bottom w:type="dxa" w:w="60"/>
+              <w:right w:type="dxa" w:w="100"/>
+            </w:tcMar>
+          </w:tcPr>
+          <w:p>
+            <w:pPr>
+              <w:spacing w:after="0" w:line="252"/>
+            </w:pPr>
+            <w:r>
+              <w:rPr>
+                <w:b w:val="false"/>
+                <w:bCs w:val="false"/>
+                <w:color w:val="000000"/>
+                <w:sz w:val="19"/>
+                <w:szCs w:val="19"/>
+              </w:rPr>
+              <w:t xml:space="preserve">final_note</w:t>
+            </w:r>
+          </w:p>
+        </w:tc>
+        <w:tc>
+          <w:tcPr>
+            <w:tcW w:type="dxa" w:w="5867"/>
+            <w:tcMar>
+              <w:top w:type="dxa" w:w="60"/>
+              <w:left w:type="dxa" w:w="100"/>
+              <w:bottom w:type="dxa" w:w="60"/>
+              <w:right w:type="dxa" w:w="100"/>
+            </w:tcMar>
+          </w:tcPr>
+          <w:p>
+            <w:pPr>
+              <w:spacing w:after="0" w:line="252"/>
+            </w:pPr>
+            <w:r>
+              <w:rPr>
+                <w:b w:val="false"/>
+                <w:bCs w:val="false"/>
+                <w:color w:val="000000"/>
+                <w:sz w:val="19"/>
+                <w:szCs w:val="19"/>
+              </w:rPr>
+              <w:t xml:space="preserve">explanation where the row's inclusion changed</w:t>
+            </w:r>
+          </w:p>
+        </w:tc>
+      </w:tr>
+    </w:tbl>
+    <w:p>
+      <w:pPr>
+        <w:spacing w:after="160"/>
+      </w:pPr>
+    </w:p>
+    <w:p>
+      <w:pPr>
+        <w:pStyle w:val="Heading2"/>
+        <w:spacing w:after="160" w:before="280"/>
+      </w:pPr>
+      <w:r>
+        <w:rPr>
+          <w:b/>
+          <w:bCs/>
+          <w:color w:val="1F4E79"/>
+          <w:sz w:val="25"/>
+          <w:szCs w:val="25"/>
+        </w:rPr>
+        <w:t xml:space="preserve">6.5  ideal_student_summary_final.csv — the final roll-up</w:t>
+      </w:r>
+    </w:p>
+    <w:p>
+      <w:pPr>
+        <w:spacing w:after="160" w:line="276"/>
+      </w:pPr>
+      <w:r>
+        <w:rPr>
+          <w:sz w:val="22"/>
+          <w:szCs w:val="22"/>
+        </w:rPr>
+        <w:t xml:space="preserve">The summary table analysts should use. Adds to the section 6.2 columns:</w:t>
+      </w:r>
+    </w:p>
+    <w:tbl>
+      <w:tblPr>
+        <w:tblW w:type="dxa" w:w="9026"/>
+        <w:tblBorders>
+          <w:top w:val="single" w:color="auto" w:sz="4"/>
+          <w:left w:val="single" w:color="auto" w:sz="4"/>
+          <w:bottom w:val="single" w:color="auto" w:sz="4"/>
+          <w:right w:val="single" w:color="auto" w:sz="4"/>
+          <w:insideH w:val="single" w:color="auto" w:sz="4"/>
+          <w:insideV w:val="single" w:color="auto" w:sz="4"/>
+        </w:tblBorders>
+      </w:tblPr>
+      <w:tblGrid>
+        <w:gridCol w:w="3159"/>
+        <w:gridCol w:w="5867"/>
+      </w:tblGrid>
+      <w:tr>
+        <w:trPr>
+          <w:tblHeader/>
+        </w:trPr>
+        <w:tc>
+          <w:tcPr>
+            <w:tcW w:type="dxa" w:w="3159"/>
             <w:shd w:fill="1F4E79" w:val="clear"/>
             <w:tcMar>
               <w:top w:type="dxa" w:w="60"/>
@@ -2590,15 +2893,571 @@
                 <w:sz w:val="19"/>
                 <w:szCs w:val="19"/>
               </w:rPr>
-              <w:t xml:space="preserve">Fee coverage (published fee matched)</w:t>
-            </w:r>
-          </w:p>
-        </w:tc>
-      </w:tr>
-      <w:tr>
-        <w:tc>
-          <w:tcPr>
-            <w:tcW w:type="dxa" w:w="1805"/>
+              <w:t xml:space="preserve">Column</w:t>
+            </w:r>
+          </w:p>
+        </w:tc>
+        <w:tc>
+          <w:tcPr>
+            <w:tcW w:type="dxa" w:w="5867"/>
+            <w:shd w:fill="1F4E79" w:val="clear"/>
+            <w:tcMar>
+              <w:top w:type="dxa" w:w="60"/>
+              <w:left w:type="dxa" w:w="100"/>
+              <w:bottom w:type="dxa" w:w="60"/>
+              <w:right w:type="dxa" w:w="100"/>
+            </w:tcMar>
+          </w:tcPr>
+          <w:p>
+            <w:pPr>
+              <w:spacing w:after="0" w:line="252"/>
+            </w:pPr>
+            <w:r>
+              <w:rPr>
+                <w:b/>
+                <w:bCs/>
+                <w:color w:val="FFFFFF"/>
+                <w:sz w:val="19"/>
+                <w:szCs w:val="19"/>
+              </w:rPr>
+              <w:t xml:space="preserve">Meaning</w:t>
+            </w:r>
+          </w:p>
+        </w:tc>
+      </w:tr>
+      <w:tr>
+        <w:tc>
+          <w:tcPr>
+            <w:tcW w:type="dxa" w:w="3159"/>
+            <w:tcMar>
+              <w:top w:type="dxa" w:w="60"/>
+              <w:left w:type="dxa" w:w="100"/>
+              <w:bottom w:type="dxa" w:w="60"/>
+              <w:right w:type="dxa" w:w="100"/>
+            </w:tcMar>
+          </w:tcPr>
+          <w:p>
+            <w:pPr>
+              <w:spacing w:after="0" w:line="252"/>
+            </w:pPr>
+            <w:r>
+              <w:rPr>
+                <w:b w:val="false"/>
+                <w:bCs w:val="false"/>
+                <w:color w:val="000000"/>
+                <w:sz w:val="19"/>
+                <w:szCs w:val="19"/>
+              </w:rPr>
+              <w:t xml:space="preserve">final_credits</w:t>
+            </w:r>
+          </w:p>
+        </w:tc>
+        <w:tc>
+          <w:tcPr>
+            <w:tcW w:type="dxa" w:w="5867"/>
+            <w:tcMar>
+              <w:top w:type="dxa" w:w="60"/>
+              <w:left w:type="dxa" w:w="100"/>
+              <w:bottom w:type="dxa" w:w="60"/>
+              <w:right w:type="dxa" w:w="100"/>
+            </w:tcMar>
+          </w:tcPr>
+          <w:p>
+            <w:pPr>
+              <w:spacing w:after="0" w:line="252"/>
+            </w:pPr>
+            <w:r>
+              <w:rPr>
+                <w:b w:val="false"/>
+                <w:bCs w:val="false"/>
+                <w:color w:val="000000"/>
+                <w:sz w:val="19"/>
+                <w:szCs w:val="19"/>
+              </w:rPr>
+              <w:t xml:space="preserve">the resolved credit load for the year</w:t>
+            </w:r>
+          </w:p>
+        </w:tc>
+      </w:tr>
+      <w:tr>
+        <w:tc>
+          <w:tcPr>
+            <w:tcW w:type="dxa" w:w="3159"/>
+            <w:tcMar>
+              <w:top w:type="dxa" w:w="60"/>
+              <w:left w:type="dxa" w:w="100"/>
+              <w:bottom w:type="dxa" w:w="60"/>
+              <w:right w:type="dxa" w:w="100"/>
+            </w:tcMar>
+          </w:tcPr>
+          <w:p>
+            <w:pPr>
+              <w:spacing w:after="0" w:line="252"/>
+            </w:pPr>
+            <w:r>
+              <w:rPr>
+                <w:b w:val="false"/>
+                <w:bCs w:val="false"/>
+                <w:color w:val="000000"/>
+                <w:sz w:val="19"/>
+                <w:szCs w:val="19"/>
+              </w:rPr>
+              <w:t xml:space="preserve">credits_stated_corrected</w:t>
+            </w:r>
+          </w:p>
+        </w:tc>
+        <w:tc>
+          <w:tcPr>
+            <w:tcW w:type="dxa" w:w="5867"/>
+            <w:tcMar>
+              <w:top w:type="dxa" w:w="60"/>
+              <w:left w:type="dxa" w:w="100"/>
+              <w:bottom w:type="dxa" w:w="60"/>
+              <w:right w:type="dxa" w:w="100"/>
+            </w:tcMar>
+          </w:tcPr>
+          <w:p>
+            <w:pPr>
+              <w:spacing w:after="0" w:line="252"/>
+            </w:pPr>
+            <w:r>
+              <w:rPr>
+                <w:b w:val="false"/>
+                <w:bCs w:val="false"/>
+                <w:color w:val="000000"/>
+                <w:sz w:val="19"/>
+                <w:szCs w:val="19"/>
+              </w:rPr>
+              <w:t xml:space="preserve">filled where a misprinted total was corrected by adjudication</w:t>
+            </w:r>
+          </w:p>
+        </w:tc>
+      </w:tr>
+      <w:tr>
+        <w:tc>
+          <w:tcPr>
+            <w:tcW w:type="dxa" w:w="3159"/>
+            <w:tcMar>
+              <w:top w:type="dxa" w:w="60"/>
+              <w:left w:type="dxa" w:w="100"/>
+              <w:bottom w:type="dxa" w:w="60"/>
+              <w:right w:type="dxa" w:w="100"/>
+            </w:tcMar>
+          </w:tcPr>
+          <w:p>
+            <w:pPr>
+              <w:spacing w:after="0" w:line="252"/>
+            </w:pPr>
+            <w:r>
+              <w:rPr>
+                <w:b w:val="false"/>
+                <w:bCs w:val="false"/>
+                <w:color w:val="000000"/>
+                <w:sz w:val="19"/>
+                <w:szCs w:val="19"/>
+              </w:rPr>
+              <w:t xml:space="preserve">final_credit_status</w:t>
+            </w:r>
+          </w:p>
+        </w:tc>
+        <w:tc>
+          <w:tcPr>
+            <w:tcW w:type="dxa" w:w="5867"/>
+            <w:tcMar>
+              <w:top w:type="dxa" w:w="60"/>
+              <w:left w:type="dxa" w:w="100"/>
+              <w:bottom w:type="dxa" w:w="60"/>
+              <w:right w:type="dxa" w:w="100"/>
+            </w:tcMar>
+          </w:tcPr>
+          <w:p>
+            <w:pPr>
+              <w:spacing w:after="0" w:line="252"/>
+            </w:pPr>
+            <w:r>
+              <w:rPr>
+                <w:b w:val="false"/>
+                <w:bCs w:val="false"/>
+                <w:color w:val="000000"/>
+                <w:sz w:val="19"/>
+                <w:szCs w:val="19"/>
+              </w:rPr>
+              <w:t xml:space="preserve">consistent / resolved_computed / resolved_manual / unresolved</w:t>
+            </w:r>
+          </w:p>
+        </w:tc>
+      </w:tr>
+      <w:tr>
+        <w:tc>
+          <w:tcPr>
+            <w:tcW w:type="dxa" w:w="3159"/>
+            <w:tcMar>
+              <w:top w:type="dxa" w:w="60"/>
+              <w:left w:type="dxa" w:w="100"/>
+              <w:bottom w:type="dxa" w:w="60"/>
+              <w:right w:type="dxa" w:w="100"/>
+            </w:tcMar>
+          </w:tcPr>
+          <w:p>
+            <w:pPr>
+              <w:spacing w:after="0" w:line="252"/>
+            </w:pPr>
+            <w:r>
+              <w:rPr>
+                <w:b w:val="false"/>
+                <w:bCs w:val="false"/>
+                <w:color w:val="000000"/>
+                <w:sz w:val="19"/>
+                <w:szCs w:val="19"/>
+              </w:rPr>
+              <w:t xml:space="preserve">final_fee_zar / final_fee_status</w:t>
+            </w:r>
+          </w:p>
+        </w:tc>
+        <w:tc>
+          <w:tcPr>
+            <w:tcW w:type="dxa" w:w="5867"/>
+            <w:tcMar>
+              <w:top w:type="dxa" w:w="60"/>
+              <w:left w:type="dxa" w:w="100"/>
+              <w:bottom w:type="dxa" w:w="60"/>
+              <w:right w:type="dxa" w:w="100"/>
+            </w:tcMar>
+          </w:tcPr>
+          <w:p>
+            <w:pPr>
+              <w:spacing w:after="0" w:line="252"/>
+            </w:pPr>
+            <w:r>
+              <w:rPr>
+                <w:b w:val="false"/>
+                <w:bCs w:val="false"/>
+                <w:color w:val="000000"/>
+                <w:sz w:val="19"/>
+                <w:szCs w:val="19"/>
+              </w:rPr>
+              <w:t xml:space="preserve">resolved cost; reconciled / published_divergent / no_published</w:t>
+            </w:r>
+          </w:p>
+        </w:tc>
+      </w:tr>
+      <w:tr>
+        <w:tc>
+          <w:tcPr>
+            <w:tcW w:type="dxa" w:w="3159"/>
+            <w:tcMar>
+              <w:top w:type="dxa" w:w="60"/>
+              <w:left w:type="dxa" w:w="100"/>
+              <w:bottom w:type="dxa" w:w="60"/>
+              <w:right w:type="dxa" w:w="100"/>
+            </w:tcMar>
+          </w:tcPr>
+          <w:p>
+            <w:pPr>
+              <w:spacing w:after="0" w:line="252"/>
+            </w:pPr>
+            <w:r>
+              <w:rPr>
+                <w:b w:val="false"/>
+                <w:bCs w:val="false"/>
+                <w:color w:val="000000"/>
+                <w:sz w:val="19"/>
+                <w:szCs w:val="19"/>
+              </w:rPr>
+              <w:t xml:space="preserve">confidence</w:t>
+            </w:r>
+          </w:p>
+        </w:tc>
+        <w:tc>
+          <w:tcPr>
+            <w:tcW w:type="dxa" w:w="5867"/>
+            <w:tcMar>
+              <w:top w:type="dxa" w:w="60"/>
+              <w:left w:type="dxa" w:w="100"/>
+              <w:bottom w:type="dxa" w:w="60"/>
+              <w:right w:type="dxa" w:w="100"/>
+            </w:tcMar>
+          </w:tcPr>
+          <w:p>
+            <w:pPr>
+              <w:spacing w:after="0" w:line="252"/>
+            </w:pPr>
+            <w:r>
+              <w:rPr>
+                <w:b w:val="false"/>
+                <w:bCs w:val="false"/>
+                <w:color w:val="000000"/>
+                <w:sz w:val="19"/>
+                <w:szCs w:val="19"/>
+              </w:rPr>
+              <w:t xml:space="preserve">high (arithmetic or adjudicated) / medium (cross-edition) / low (default policy)</w:t>
+            </w:r>
+          </w:p>
+        </w:tc>
+      </w:tr>
+      <w:tr>
+        <w:tc>
+          <w:tcPr>
+            <w:tcW w:type="dxa" w:w="3159"/>
+            <w:tcMar>
+              <w:top w:type="dxa" w:w="60"/>
+              <w:left w:type="dxa" w:w="100"/>
+              <w:bottom w:type="dxa" w:w="60"/>
+              <w:right w:type="dxa" w:w="100"/>
+            </w:tcMar>
+          </w:tcPr>
+          <w:p>
+            <w:pPr>
+              <w:spacing w:after="0" w:line="252"/>
+            </w:pPr>
+            <w:r>
+              <w:rPr>
+                <w:b w:val="false"/>
+                <w:bCs w:val="false"/>
+                <w:color w:val="000000"/>
+                <w:sz w:val="19"/>
+                <w:szCs w:val="19"/>
+              </w:rPr>
+              <w:t xml:space="preserve">resolution_rationale</w:t>
+            </w:r>
+          </w:p>
+        </w:tc>
+        <w:tc>
+          <w:tcPr>
+            <w:tcW w:type="dxa" w:w="5867"/>
+            <w:tcMar>
+              <w:top w:type="dxa" w:w="60"/>
+              <w:left w:type="dxa" w:w="100"/>
+              <w:bottom w:type="dxa" w:w="60"/>
+              <w:right w:type="dxa" w:w="100"/>
+            </w:tcMar>
+          </w:tcPr>
+          <w:p>
+            <w:pPr>
+              <w:spacing w:after="0" w:line="252"/>
+            </w:pPr>
+            <w:r>
+              <w:rPr>
+                <w:b w:val="false"/>
+                <w:bCs w:val="false"/>
+                <w:color w:val="000000"/>
+                <w:sz w:val="19"/>
+                <w:szCs w:val="19"/>
+              </w:rPr>
+              <w:t xml:space="preserve">the written justification, in full sentences</w:t>
+            </w:r>
+          </w:p>
+        </w:tc>
+      </w:tr>
+    </w:tbl>
+    <w:p>
+      <w:pPr>
+        <w:spacing w:after="160"/>
+      </w:pPr>
+    </w:p>
+    <w:p>
+      <w:pPr>
+        <w:spacing w:after="160" w:line="276"/>
+      </w:pPr>
+      <w:r>
+        <w:rPr>
+          <w:sz w:val="22"/>
+          <w:szCs w:val="22"/>
+        </w:rPr>
+        <w:t xml:space="preserve">How discrepancies are resolved — the rule order, the evidence each rule demands, and worked examples — is documented in docs/FINAL-DATASET-METHOD.md. In short: printed arithmetic identities and corroborated cross-edition evidence resolve automatically; genuine ambiguities are adjudicated case-by-case in a reviewable register (resolutions/com.csv) with rationale and page evidence; everything else is flagged unresolved at low confidence rather than silently guessed.</w:t>
+      </w:r>
+    </w:p>
+    <w:p>
+      <w:pPr>
+        <w:pStyle w:val="Heading1"/>
+        <w:spacing w:after="200" w:before="360"/>
+      </w:pPr>
+      <w:r>
+        <w:rPr>
+          <w:b/>
+          <w:bCs/>
+          <w:color w:val="1F4E79"/>
+          <w:sz w:val="30"/>
+          <w:szCs w:val="30"/>
+        </w:rPr>
+        <w:t xml:space="preserve">7. How the data is validated</w:t>
+      </w:r>
+    </w:p>
+    <w:p>
+      <w:pPr>
+        <w:spacing w:after="160" w:line="276"/>
+      </w:pPr>
+      <w:r>
+        <w:rPr>
+          <w:sz w:val="22"/>
+          <w:szCs w:val="22"/>
+        </w:rPr>
+        <w:t xml:space="preserve">Each specialisation-year is checked from two independent directions — a validation triangle. The curriculum (courses and credits) priced with the course-fee table gives a computed year cost; the credits are compared with the handbook's printed “Total credits per year”, and the cost with the fees book's published typical fee for that programme-year.</w:t>
+      </w:r>
+    </w:p>
+    <w:tbl>
+      <w:tblPr>
+        <w:tblW w:type="dxa" w:w="9026"/>
+        <w:tblBorders>
+          <w:top w:val="single" w:color="auto" w:sz="4"/>
+          <w:left w:val="single" w:color="auto" w:sz="4"/>
+          <w:bottom w:val="single" w:color="auto" w:sz="4"/>
+          <w:right w:val="single" w:color="auto" w:sz="4"/>
+          <w:insideH w:val="single" w:color="auto" w:sz="4"/>
+          <w:insideV w:val="single" w:color="auto" w:sz="4"/>
+        </w:tblBorders>
+      </w:tblPr>
+      <w:tblGrid>
+        <w:gridCol w:w="1231"/>
+        <w:gridCol w:w="1641"/>
+        <w:gridCol w:w="2051"/>
+        <w:gridCol w:w="2051"/>
+        <w:gridCol w:w="2051"/>
+      </w:tblGrid>
+      <w:tr>
+        <w:trPr>
+          <w:tblHeader/>
+        </w:trPr>
+        <w:tc>
+          <w:tcPr>
+            <w:tcW w:type="dxa" w:w="1231"/>
+            <w:shd w:fill="1F4E79" w:val="clear"/>
+            <w:tcMar>
+              <w:top w:type="dxa" w:w="60"/>
+              <w:left w:type="dxa" w:w="100"/>
+              <w:bottom w:type="dxa" w:w="60"/>
+              <w:right w:type="dxa" w:w="100"/>
+            </w:tcMar>
+          </w:tcPr>
+          <w:p>
+            <w:pPr>
+              <w:spacing w:after="0" w:line="252"/>
+            </w:pPr>
+            <w:r>
+              <w:rPr>
+                <w:b/>
+                <w:bCs/>
+                <w:color w:val="FFFFFF"/>
+                <w:sz w:val="19"/>
+                <w:szCs w:val="19"/>
+              </w:rPr>
+              <w:t xml:space="preserve">Year</w:t>
+            </w:r>
+          </w:p>
+        </w:tc>
+        <w:tc>
+          <w:tcPr>
+            <w:tcW w:type="dxa" w:w="1641"/>
+            <w:shd w:fill="1F4E79" w:val="clear"/>
+            <w:tcMar>
+              <w:top w:type="dxa" w:w="60"/>
+              <w:left w:type="dxa" w:w="100"/>
+              <w:bottom w:type="dxa" w:w="60"/>
+              <w:right w:type="dxa" w:w="100"/>
+            </w:tcMar>
+          </w:tcPr>
+          <w:p>
+            <w:pPr>
+              <w:spacing w:after="0" w:line="252"/>
+            </w:pPr>
+            <w:r>
+              <w:rPr>
+                <w:b/>
+                <w:bCs/>
+                <w:color w:val="FFFFFF"/>
+                <w:sz w:val="19"/>
+                <w:szCs w:val="19"/>
+              </w:rPr>
+              <w:t xml:space="preserve">Spec-years</w:t>
+            </w:r>
+          </w:p>
+        </w:tc>
+        <w:tc>
+          <w:tcPr>
+            <w:tcW w:type="dxa" w:w="2051"/>
+            <w:shd w:fill="1F4E79" w:val="clear"/>
+            <w:tcMar>
+              <w:top w:type="dxa" w:w="60"/>
+              <w:left w:type="dxa" w:w="100"/>
+              <w:bottom w:type="dxa" w:w="60"/>
+              <w:right w:type="dxa" w:w="100"/>
+            </w:tcMar>
+          </w:tcPr>
+          <w:p>
+            <w:pPr>
+              <w:spacing w:after="0" w:line="252"/>
+            </w:pPr>
+            <w:r>
+              <w:rPr>
+                <w:b/>
+                <w:bCs/>
+                <w:color w:val="FFFFFF"/>
+                <w:sz w:val="19"/>
+                <w:szCs w:val="19"/>
+              </w:rPr>
+              <w:t xml:space="preserve">Consistent as printed</w:t>
+            </w:r>
+          </w:p>
+        </w:tc>
+        <w:tc>
+          <w:tcPr>
+            <w:tcW w:type="dxa" w:w="2051"/>
+            <w:shd w:fill="1F4E79" w:val="clear"/>
+            <w:tcMar>
+              <w:top w:type="dxa" w:w="60"/>
+              <w:left w:type="dxa" w:w="100"/>
+              <w:bottom w:type="dxa" w:w="60"/>
+              <w:right w:type="dxa" w:w="100"/>
+            </w:tcMar>
+          </w:tcPr>
+          <w:p>
+            <w:pPr>
+              <w:spacing w:after="0" w:line="252"/>
+            </w:pPr>
+            <w:r>
+              <w:rPr>
+                <w:b/>
+                <w:bCs/>
+                <w:color w:val="FFFFFF"/>
+                <w:sz w:val="19"/>
+                <w:szCs w:val="19"/>
+              </w:rPr>
+              <w:t xml:space="preserve">Resolved by rule/adjudication</w:t>
+            </w:r>
+          </w:p>
+        </w:tc>
+        <w:tc>
+          <w:tcPr>
+            <w:tcW w:type="dxa" w:w="2051"/>
+            <w:shd w:fill="1F4E79" w:val="clear"/>
+            <w:tcMar>
+              <w:top w:type="dxa" w:w="60"/>
+              <w:left w:type="dxa" w:w="100"/>
+              <w:bottom w:type="dxa" w:w="60"/>
+              <w:right w:type="dxa" w:w="100"/>
+            </w:tcMar>
+          </w:tcPr>
+          <w:p>
+            <w:pPr>
+              <w:spacing w:after="0" w:line="252"/>
+            </w:pPr>
+            <w:r>
+              <w:rPr>
+                <w:b/>
+                <w:bCs/>
+                <w:color w:val="FFFFFF"/>
+                <w:sz w:val="19"/>
+                <w:szCs w:val="19"/>
+              </w:rPr>
+              <w:t xml:space="preserve">Unresolved (flagged)</w:t>
+            </w:r>
+          </w:p>
+        </w:tc>
+      </w:tr>
+      <w:tr>
+        <w:tc>
+          <w:tcPr>
+            <w:tcW w:type="dxa" w:w="1231"/>
             <w:tcMar>
               <w:top w:type="dxa" w:w="60"/>
               <w:left w:type="dxa" w:w="100"/>
@@ -2624,61 +3483,113 @@
         </w:tc>
         <w:tc>
           <w:tcPr>
-            <w:tcW w:type="dxa" w:w="3610"/>
-            <w:tcMar>
-              <w:top w:type="dxa" w:w="60"/>
-              <w:left w:type="dxa" w:w="100"/>
-              <w:bottom w:type="dxa" w:w="60"/>
-              <w:right w:type="dxa" w:w="100"/>
-            </w:tcMar>
-          </w:tcPr>
-          <w:p>
-            <w:pPr>
-              <w:spacing w:after="0" w:line="252"/>
-            </w:pPr>
-            <w:r>
-              <w:rPr>
-                <w:b w:val="false"/>
-                <w:bCs w:val="false"/>
-                <w:color w:val="000000"/>
-                <w:sz w:val="19"/>
-                <w:szCs w:val="19"/>
-              </w:rPr>
-              <w:t xml:space="preserve">218 of 269</w:t>
-            </w:r>
-          </w:p>
-        </w:tc>
-        <w:tc>
-          <w:tcPr>
-            <w:tcW w:type="dxa" w:w="3610"/>
-            <w:tcMar>
-              <w:top w:type="dxa" w:w="60"/>
-              <w:left w:type="dxa" w:w="100"/>
-              <w:bottom w:type="dxa" w:w="60"/>
-              <w:right w:type="dxa" w:w="100"/>
-            </w:tcMar>
-          </w:tcPr>
-          <w:p>
-            <w:pPr>
-              <w:spacing w:after="0" w:line="252"/>
-            </w:pPr>
-            <w:r>
-              <w:rPr>
-                <w:b w:val="false"/>
-                <w:bCs w:val="false"/>
-                <w:color w:val="000000"/>
-                <w:sz w:val="19"/>
-                <w:szCs w:val="19"/>
-              </w:rPr>
-              <w:t xml:space="preserve">164 of 269</w:t>
-            </w:r>
-          </w:p>
-        </w:tc>
-      </w:tr>
-      <w:tr>
-        <w:tc>
-          <w:tcPr>
-            <w:tcW w:type="dxa" w:w="1805"/>
+            <w:tcW w:type="dxa" w:w="1641"/>
+            <w:tcMar>
+              <w:top w:type="dxa" w:w="60"/>
+              <w:left w:type="dxa" w:w="100"/>
+              <w:bottom w:type="dxa" w:w="60"/>
+              <w:right w:type="dxa" w:w="100"/>
+            </w:tcMar>
+          </w:tcPr>
+          <w:p>
+            <w:pPr>
+              <w:spacing w:after="0" w:line="252"/>
+            </w:pPr>
+            <w:r>
+              <w:rPr>
+                <w:b w:val="false"/>
+                <w:bCs w:val="false"/>
+                <w:color w:val="000000"/>
+                <w:sz w:val="19"/>
+                <w:szCs w:val="19"/>
+              </w:rPr>
+              <w:t xml:space="preserve">274</w:t>
+            </w:r>
+          </w:p>
+        </w:tc>
+        <w:tc>
+          <w:tcPr>
+            <w:tcW w:type="dxa" w:w="2051"/>
+            <w:tcMar>
+              <w:top w:type="dxa" w:w="60"/>
+              <w:left w:type="dxa" w:w="100"/>
+              <w:bottom w:type="dxa" w:w="60"/>
+              <w:right w:type="dxa" w:w="100"/>
+            </w:tcMar>
+          </w:tcPr>
+          <w:p>
+            <w:pPr>
+              <w:spacing w:after="0" w:line="252"/>
+            </w:pPr>
+            <w:r>
+              <w:rPr>
+                <w:b w:val="false"/>
+                <w:bCs w:val="false"/>
+                <w:color w:val="000000"/>
+                <w:sz w:val="19"/>
+                <w:szCs w:val="19"/>
+              </w:rPr>
+              <w:t xml:space="preserve">227</w:t>
+            </w:r>
+          </w:p>
+        </w:tc>
+        <w:tc>
+          <w:tcPr>
+            <w:tcW w:type="dxa" w:w="2051"/>
+            <w:tcMar>
+              <w:top w:type="dxa" w:w="60"/>
+              <w:left w:type="dxa" w:w="100"/>
+              <w:bottom w:type="dxa" w:w="60"/>
+              <w:right w:type="dxa" w:w="100"/>
+            </w:tcMar>
+          </w:tcPr>
+          <w:p>
+            <w:pPr>
+              <w:spacing w:after="0" w:line="252"/>
+            </w:pPr>
+            <w:r>
+              <w:rPr>
+                <w:b w:val="false"/>
+                <w:bCs w:val="false"/>
+                <w:color w:val="000000"/>
+                <w:sz w:val="19"/>
+                <w:szCs w:val="19"/>
+              </w:rPr>
+              <w:t xml:space="preserve">17</w:t>
+            </w:r>
+          </w:p>
+        </w:tc>
+        <w:tc>
+          <w:tcPr>
+            <w:tcW w:type="dxa" w:w="2051"/>
+            <w:tcMar>
+              <w:top w:type="dxa" w:w="60"/>
+              <w:left w:type="dxa" w:w="100"/>
+              <w:bottom w:type="dxa" w:w="60"/>
+              <w:right w:type="dxa" w:w="100"/>
+            </w:tcMar>
+          </w:tcPr>
+          <w:p>
+            <w:pPr>
+              <w:spacing w:after="0" w:line="252"/>
+            </w:pPr>
+            <w:r>
+              <w:rPr>
+                <w:b w:val="false"/>
+                <w:bCs w:val="false"/>
+                <w:color w:val="000000"/>
+                <w:sz w:val="19"/>
+                <w:szCs w:val="19"/>
+              </w:rPr>
+              <w:t xml:space="preserve">30</w:t>
+            </w:r>
+          </w:p>
+        </w:tc>
+      </w:tr>
+      <w:tr>
+        <w:tc>
+          <w:tcPr>
+            <w:tcW w:type="dxa" w:w="1231"/>
             <w:tcMar>
               <w:top w:type="dxa" w:w="60"/>
               <w:left w:type="dxa" w:w="100"/>
@@ -2704,61 +3615,113 @@
         </w:tc>
         <w:tc>
           <w:tcPr>
-            <w:tcW w:type="dxa" w:w="3610"/>
-            <w:tcMar>
-              <w:top w:type="dxa" w:w="60"/>
-              <w:left w:type="dxa" w:w="100"/>
-              <w:bottom w:type="dxa" w:w="60"/>
-              <w:right w:type="dxa" w:w="100"/>
-            </w:tcMar>
-          </w:tcPr>
-          <w:p>
-            <w:pPr>
-              <w:spacing w:after="0" w:line="252"/>
-            </w:pPr>
-            <w:r>
-              <w:rPr>
-                <w:b w:val="false"/>
-                <w:bCs w:val="false"/>
-                <w:color w:val="000000"/>
-                <w:sz w:val="19"/>
-                <w:szCs w:val="19"/>
-              </w:rPr>
-              <w:t xml:space="preserve">216 of 261</w:t>
-            </w:r>
-          </w:p>
-        </w:tc>
-        <w:tc>
-          <w:tcPr>
-            <w:tcW w:type="dxa" w:w="3610"/>
-            <w:tcMar>
-              <w:top w:type="dxa" w:w="60"/>
-              <w:left w:type="dxa" w:w="100"/>
-              <w:bottom w:type="dxa" w:w="60"/>
-              <w:right w:type="dxa" w:w="100"/>
-            </w:tcMar>
-          </w:tcPr>
-          <w:p>
-            <w:pPr>
-              <w:spacing w:after="0" w:line="252"/>
-            </w:pPr>
-            <w:r>
-              <w:rPr>
-                <w:b w:val="false"/>
-                <w:bCs w:val="false"/>
-                <w:color w:val="000000"/>
-                <w:sz w:val="19"/>
-                <w:szCs w:val="19"/>
-              </w:rPr>
-              <w:t xml:space="preserve">160 of 261</w:t>
-            </w:r>
-          </w:p>
-        </w:tc>
-      </w:tr>
-      <w:tr>
-        <w:tc>
-          <w:tcPr>
-            <w:tcW w:type="dxa" w:w="1805"/>
+            <w:tcW w:type="dxa" w:w="1641"/>
+            <w:tcMar>
+              <w:top w:type="dxa" w:w="60"/>
+              <w:left w:type="dxa" w:w="100"/>
+              <w:bottom w:type="dxa" w:w="60"/>
+              <w:right w:type="dxa" w:w="100"/>
+            </w:tcMar>
+          </w:tcPr>
+          <w:p>
+            <w:pPr>
+              <w:spacing w:after="0" w:line="252"/>
+            </w:pPr>
+            <w:r>
+              <w:rPr>
+                <w:b w:val="false"/>
+                <w:bCs w:val="false"/>
+                <w:color w:val="000000"/>
+                <w:sz w:val="19"/>
+                <w:szCs w:val="19"/>
+              </w:rPr>
+              <w:t xml:space="preserve">275</w:t>
+            </w:r>
+          </w:p>
+        </w:tc>
+        <w:tc>
+          <w:tcPr>
+            <w:tcW w:type="dxa" w:w="2051"/>
+            <w:tcMar>
+              <w:top w:type="dxa" w:w="60"/>
+              <w:left w:type="dxa" w:w="100"/>
+              <w:bottom w:type="dxa" w:w="60"/>
+              <w:right w:type="dxa" w:w="100"/>
+            </w:tcMar>
+          </w:tcPr>
+          <w:p>
+            <w:pPr>
+              <w:spacing w:after="0" w:line="252"/>
+            </w:pPr>
+            <w:r>
+              <w:rPr>
+                <w:b w:val="false"/>
+                <w:bCs w:val="false"/>
+                <w:color w:val="000000"/>
+                <w:sz w:val="19"/>
+                <w:szCs w:val="19"/>
+              </w:rPr>
+              <w:t xml:space="preserve">240</w:t>
+            </w:r>
+          </w:p>
+        </w:tc>
+        <w:tc>
+          <w:tcPr>
+            <w:tcW w:type="dxa" w:w="2051"/>
+            <w:tcMar>
+              <w:top w:type="dxa" w:w="60"/>
+              <w:left w:type="dxa" w:w="100"/>
+              <w:bottom w:type="dxa" w:w="60"/>
+              <w:right w:type="dxa" w:w="100"/>
+            </w:tcMar>
+          </w:tcPr>
+          <w:p>
+            <w:pPr>
+              <w:spacing w:after="0" w:line="252"/>
+            </w:pPr>
+            <w:r>
+              <w:rPr>
+                <w:b w:val="false"/>
+                <w:bCs w:val="false"/>
+                <w:color w:val="000000"/>
+                <w:sz w:val="19"/>
+                <w:szCs w:val="19"/>
+              </w:rPr>
+              <w:t xml:space="preserve">11</w:t>
+            </w:r>
+          </w:p>
+        </w:tc>
+        <w:tc>
+          <w:tcPr>
+            <w:tcW w:type="dxa" w:w="2051"/>
+            <w:tcMar>
+              <w:top w:type="dxa" w:w="60"/>
+              <w:left w:type="dxa" w:w="100"/>
+              <w:bottom w:type="dxa" w:w="60"/>
+              <w:right w:type="dxa" w:w="100"/>
+            </w:tcMar>
+          </w:tcPr>
+          <w:p>
+            <w:pPr>
+              <w:spacing w:after="0" w:line="252"/>
+            </w:pPr>
+            <w:r>
+              <w:rPr>
+                <w:b w:val="false"/>
+                <w:bCs w:val="false"/>
+                <w:color w:val="000000"/>
+                <w:sz w:val="19"/>
+                <w:szCs w:val="19"/>
+              </w:rPr>
+              <w:t xml:space="preserve">24</w:t>
+            </w:r>
+          </w:p>
+        </w:tc>
+      </w:tr>
+      <w:tr>
+        <w:tc>
+          <w:tcPr>
+            <w:tcW w:type="dxa" w:w="1231"/>
             <w:tcMar>
               <w:top w:type="dxa" w:w="60"/>
               <w:left w:type="dxa" w:w="100"/>
@@ -2784,61 +3747,113 @@
         </w:tc>
         <w:tc>
           <w:tcPr>
-            <w:tcW w:type="dxa" w:w="3610"/>
-            <w:tcMar>
-              <w:top w:type="dxa" w:w="60"/>
-              <w:left w:type="dxa" w:w="100"/>
-              <w:bottom w:type="dxa" w:w="60"/>
-              <w:right w:type="dxa" w:w="100"/>
-            </w:tcMar>
-          </w:tcPr>
-          <w:p>
-            <w:pPr>
-              <w:spacing w:after="0" w:line="252"/>
-            </w:pPr>
-            <w:r>
-              <w:rPr>
-                <w:b w:val="false"/>
-                <w:bCs w:val="false"/>
-                <w:color w:val="000000"/>
-                <w:sz w:val="19"/>
-                <w:szCs w:val="19"/>
-              </w:rPr>
-              <w:t xml:space="preserve">209 of 265</w:t>
-            </w:r>
-          </w:p>
-        </w:tc>
-        <w:tc>
-          <w:tcPr>
-            <w:tcW w:type="dxa" w:w="3610"/>
-            <w:tcMar>
-              <w:top w:type="dxa" w:w="60"/>
-              <w:left w:type="dxa" w:w="100"/>
-              <w:bottom w:type="dxa" w:w="60"/>
-              <w:right w:type="dxa" w:w="100"/>
-            </w:tcMar>
-          </w:tcPr>
-          <w:p>
-            <w:pPr>
-              <w:spacing w:after="0" w:line="252"/>
-            </w:pPr>
-            <w:r>
-              <w:rPr>
-                <w:b w:val="false"/>
-                <w:bCs w:val="false"/>
-                <w:color w:val="000000"/>
-                <w:sz w:val="19"/>
-                <w:szCs w:val="19"/>
-              </w:rPr>
-              <w:t xml:space="preserve">158 of 265</w:t>
-            </w:r>
-          </w:p>
-        </w:tc>
-      </w:tr>
-      <w:tr>
-        <w:tc>
-          <w:tcPr>
-            <w:tcW w:type="dxa" w:w="1805"/>
+            <w:tcW w:type="dxa" w:w="1641"/>
+            <w:tcMar>
+              <w:top w:type="dxa" w:w="60"/>
+              <w:left w:type="dxa" w:w="100"/>
+              <w:bottom w:type="dxa" w:w="60"/>
+              <w:right w:type="dxa" w:w="100"/>
+            </w:tcMar>
+          </w:tcPr>
+          <w:p>
+            <w:pPr>
+              <w:spacing w:after="0" w:line="252"/>
+            </w:pPr>
+            <w:r>
+              <w:rPr>
+                <w:b w:val="false"/>
+                <w:bCs w:val="false"/>
+                <w:color w:val="000000"/>
+                <w:sz w:val="19"/>
+                <w:szCs w:val="19"/>
+              </w:rPr>
+              <w:t xml:space="preserve">276</w:t>
+            </w:r>
+          </w:p>
+        </w:tc>
+        <w:tc>
+          <w:tcPr>
+            <w:tcW w:type="dxa" w:w="2051"/>
+            <w:tcMar>
+              <w:top w:type="dxa" w:w="60"/>
+              <w:left w:type="dxa" w:w="100"/>
+              <w:bottom w:type="dxa" w:w="60"/>
+              <w:right w:type="dxa" w:w="100"/>
+            </w:tcMar>
+          </w:tcPr>
+          <w:p>
+            <w:pPr>
+              <w:spacing w:after="0" w:line="252"/>
+            </w:pPr>
+            <w:r>
+              <w:rPr>
+                <w:b w:val="false"/>
+                <w:bCs w:val="false"/>
+                <w:color w:val="000000"/>
+                <w:sz w:val="19"/>
+                <w:szCs w:val="19"/>
+              </w:rPr>
+              <w:t xml:space="preserve">225</w:t>
+            </w:r>
+          </w:p>
+        </w:tc>
+        <w:tc>
+          <w:tcPr>
+            <w:tcW w:type="dxa" w:w="2051"/>
+            <w:tcMar>
+              <w:top w:type="dxa" w:w="60"/>
+              <w:left w:type="dxa" w:w="100"/>
+              <w:bottom w:type="dxa" w:w="60"/>
+              <w:right w:type="dxa" w:w="100"/>
+            </w:tcMar>
+          </w:tcPr>
+          <w:p>
+            <w:pPr>
+              <w:spacing w:after="0" w:line="252"/>
+            </w:pPr>
+            <w:r>
+              <w:rPr>
+                <w:b w:val="false"/>
+                <w:bCs w:val="false"/>
+                <w:color w:val="000000"/>
+                <w:sz w:val="19"/>
+                <w:szCs w:val="19"/>
+              </w:rPr>
+              <w:t xml:space="preserve">15</w:t>
+            </w:r>
+          </w:p>
+        </w:tc>
+        <w:tc>
+          <w:tcPr>
+            <w:tcW w:type="dxa" w:w="2051"/>
+            <w:tcMar>
+              <w:top w:type="dxa" w:w="60"/>
+              <w:left w:type="dxa" w:w="100"/>
+              <w:bottom w:type="dxa" w:w="60"/>
+              <w:right w:type="dxa" w:w="100"/>
+            </w:tcMar>
+          </w:tcPr>
+          <w:p>
+            <w:pPr>
+              <w:spacing w:after="0" w:line="252"/>
+            </w:pPr>
+            <w:r>
+              <w:rPr>
+                <w:b w:val="false"/>
+                <w:bCs w:val="false"/>
+                <w:color w:val="000000"/>
+                <w:sz w:val="19"/>
+                <w:szCs w:val="19"/>
+              </w:rPr>
+              <w:t xml:space="preserve">36</w:t>
+            </w:r>
+          </w:p>
+        </w:tc>
+      </w:tr>
+      <w:tr>
+        <w:tc>
+          <w:tcPr>
+            <w:tcW w:type="dxa" w:w="1231"/>
             <w:tcMar>
               <w:top w:type="dxa" w:w="60"/>
               <w:left w:type="dxa" w:w="100"/>
@@ -2864,61 +3879,113 @@
         </w:tc>
         <w:tc>
           <w:tcPr>
-            <w:tcW w:type="dxa" w:w="3610"/>
-            <w:tcMar>
-              <w:top w:type="dxa" w:w="60"/>
-              <w:left w:type="dxa" w:w="100"/>
-              <w:bottom w:type="dxa" w:w="60"/>
-              <w:right w:type="dxa" w:w="100"/>
-            </w:tcMar>
-          </w:tcPr>
-          <w:p>
-            <w:pPr>
-              <w:spacing w:after="0" w:line="252"/>
-            </w:pPr>
-            <w:r>
-              <w:rPr>
-                <w:b w:val="false"/>
-                <w:bCs w:val="false"/>
-                <w:color w:val="000000"/>
-                <w:sz w:val="19"/>
-                <w:szCs w:val="19"/>
-              </w:rPr>
-              <w:t xml:space="preserve">181 of 255</w:t>
-            </w:r>
-          </w:p>
-        </w:tc>
-        <w:tc>
-          <w:tcPr>
-            <w:tcW w:type="dxa" w:w="3610"/>
-            <w:tcMar>
-              <w:top w:type="dxa" w:w="60"/>
-              <w:left w:type="dxa" w:w="100"/>
-              <w:bottom w:type="dxa" w:w="60"/>
-              <w:right w:type="dxa" w:w="100"/>
-            </w:tcMar>
-          </w:tcPr>
-          <w:p>
-            <w:pPr>
-              <w:spacing w:after="0" w:line="252"/>
-            </w:pPr>
-            <w:r>
-              <w:rPr>
-                <w:b w:val="false"/>
-                <w:bCs w:val="false"/>
-                <w:color w:val="000000"/>
-                <w:sz w:val="19"/>
-                <w:szCs w:val="19"/>
-              </w:rPr>
-              <w:t xml:space="preserve">178 of 255</w:t>
-            </w:r>
-          </w:p>
-        </w:tc>
-      </w:tr>
-      <w:tr>
-        <w:tc>
-          <w:tcPr>
-            <w:tcW w:type="dxa" w:w="1805"/>
+            <w:tcW w:type="dxa" w:w="1641"/>
+            <w:tcMar>
+              <w:top w:type="dxa" w:w="60"/>
+              <w:left w:type="dxa" w:w="100"/>
+              <w:bottom w:type="dxa" w:w="60"/>
+              <w:right w:type="dxa" w:w="100"/>
+            </w:tcMar>
+          </w:tcPr>
+          <w:p>
+            <w:pPr>
+              <w:spacing w:after="0" w:line="252"/>
+            </w:pPr>
+            <w:r>
+              <w:rPr>
+                <w:b w:val="false"/>
+                <w:bCs w:val="false"/>
+                <w:color w:val="000000"/>
+                <w:sz w:val="19"/>
+                <w:szCs w:val="19"/>
+              </w:rPr>
+              <w:t xml:space="preserve">271</w:t>
+            </w:r>
+          </w:p>
+        </w:tc>
+        <w:tc>
+          <w:tcPr>
+            <w:tcW w:type="dxa" w:w="2051"/>
+            <w:tcMar>
+              <w:top w:type="dxa" w:w="60"/>
+              <w:left w:type="dxa" w:w="100"/>
+              <w:bottom w:type="dxa" w:w="60"/>
+              <w:right w:type="dxa" w:w="100"/>
+            </w:tcMar>
+          </w:tcPr>
+          <w:p>
+            <w:pPr>
+              <w:spacing w:after="0" w:line="252"/>
+            </w:pPr>
+            <w:r>
+              <w:rPr>
+                <w:b w:val="false"/>
+                <w:bCs w:val="false"/>
+                <w:color w:val="000000"/>
+                <w:sz w:val="19"/>
+                <w:szCs w:val="19"/>
+              </w:rPr>
+              <w:t xml:space="preserve">203</w:t>
+            </w:r>
+          </w:p>
+        </w:tc>
+        <w:tc>
+          <w:tcPr>
+            <w:tcW w:type="dxa" w:w="2051"/>
+            <w:tcMar>
+              <w:top w:type="dxa" w:w="60"/>
+              <w:left w:type="dxa" w:w="100"/>
+              <w:bottom w:type="dxa" w:w="60"/>
+              <w:right w:type="dxa" w:w="100"/>
+            </w:tcMar>
+          </w:tcPr>
+          <w:p>
+            <w:pPr>
+              <w:spacing w:after="0" w:line="252"/>
+            </w:pPr>
+            <w:r>
+              <w:rPr>
+                <w:b w:val="false"/>
+                <w:bCs w:val="false"/>
+                <w:color w:val="000000"/>
+                <w:sz w:val="19"/>
+                <w:szCs w:val="19"/>
+              </w:rPr>
+              <w:t xml:space="preserve">13</w:t>
+            </w:r>
+          </w:p>
+        </w:tc>
+        <w:tc>
+          <w:tcPr>
+            <w:tcW w:type="dxa" w:w="2051"/>
+            <w:tcMar>
+              <w:top w:type="dxa" w:w="60"/>
+              <w:left w:type="dxa" w:w="100"/>
+              <w:bottom w:type="dxa" w:w="60"/>
+              <w:right w:type="dxa" w:w="100"/>
+            </w:tcMar>
+          </w:tcPr>
+          <w:p>
+            <w:pPr>
+              <w:spacing w:after="0" w:line="252"/>
+            </w:pPr>
+            <w:r>
+              <w:rPr>
+                <w:b w:val="false"/>
+                <w:bCs w:val="false"/>
+                <w:color w:val="000000"/>
+                <w:sz w:val="19"/>
+                <w:szCs w:val="19"/>
+              </w:rPr>
+              <w:t xml:space="preserve">55</w:t>
+            </w:r>
+          </w:p>
+        </w:tc>
+      </w:tr>
+      <w:tr>
+        <w:tc>
+          <w:tcPr>
+            <w:tcW w:type="dxa" w:w="1231"/>
             <w:tcMar>
               <w:top w:type="dxa" w:w="60"/>
               <w:left w:type="dxa" w:w="100"/>
@@ -2944,61 +4011,113 @@
         </w:tc>
         <w:tc>
           <w:tcPr>
-            <w:tcW w:type="dxa" w:w="3610"/>
-            <w:tcMar>
-              <w:top w:type="dxa" w:w="60"/>
-              <w:left w:type="dxa" w:w="100"/>
-              <w:bottom w:type="dxa" w:w="60"/>
-              <w:right w:type="dxa" w:w="100"/>
-            </w:tcMar>
-          </w:tcPr>
-          <w:p>
-            <w:pPr>
-              <w:spacing w:after="0" w:line="252"/>
-            </w:pPr>
-            <w:r>
-              <w:rPr>
-                <w:b w:val="false"/>
-                <w:bCs w:val="false"/>
-                <w:color w:val="000000"/>
-                <w:sz w:val="19"/>
-                <w:szCs w:val="19"/>
-              </w:rPr>
-              <w:t xml:space="preserve">217 of 266</w:t>
-            </w:r>
-          </w:p>
-        </w:tc>
-        <w:tc>
-          <w:tcPr>
-            <w:tcW w:type="dxa" w:w="3610"/>
-            <w:tcMar>
-              <w:top w:type="dxa" w:w="60"/>
-              <w:left w:type="dxa" w:w="100"/>
-              <w:bottom w:type="dxa" w:w="60"/>
-              <w:right w:type="dxa" w:w="100"/>
-            </w:tcMar>
-          </w:tcPr>
-          <w:p>
-            <w:pPr>
-              <w:spacing w:after="0" w:line="252"/>
-            </w:pPr>
-            <w:r>
-              <w:rPr>
-                <w:b w:val="false"/>
-                <w:bCs w:val="false"/>
-                <w:color w:val="000000"/>
-                <w:sz w:val="19"/>
-                <w:szCs w:val="19"/>
-              </w:rPr>
-              <w:t xml:space="preserve">180 of 266</w:t>
-            </w:r>
-          </w:p>
-        </w:tc>
-      </w:tr>
-      <w:tr>
-        <w:tc>
-          <w:tcPr>
-            <w:tcW w:type="dxa" w:w="1805"/>
+            <w:tcW w:type="dxa" w:w="1641"/>
+            <w:tcMar>
+              <w:top w:type="dxa" w:w="60"/>
+              <w:left w:type="dxa" w:w="100"/>
+              <w:bottom w:type="dxa" w:w="60"/>
+              <w:right w:type="dxa" w:w="100"/>
+            </w:tcMar>
+          </w:tcPr>
+          <w:p>
+            <w:pPr>
+              <w:spacing w:after="0" w:line="252"/>
+            </w:pPr>
+            <w:r>
+              <w:rPr>
+                <w:b w:val="false"/>
+                <w:bCs w:val="false"/>
+                <w:color w:val="000000"/>
+                <w:sz w:val="19"/>
+                <w:szCs w:val="19"/>
+              </w:rPr>
+              <w:t xml:space="preserve">268</w:t>
+            </w:r>
+          </w:p>
+        </w:tc>
+        <w:tc>
+          <w:tcPr>
+            <w:tcW w:type="dxa" w:w="2051"/>
+            <w:tcMar>
+              <w:top w:type="dxa" w:w="60"/>
+              <w:left w:type="dxa" w:w="100"/>
+              <w:bottom w:type="dxa" w:w="60"/>
+              <w:right w:type="dxa" w:w="100"/>
+            </w:tcMar>
+          </w:tcPr>
+          <w:p>
+            <w:pPr>
+              <w:spacing w:after="0" w:line="252"/>
+            </w:pPr>
+            <w:r>
+              <w:rPr>
+                <w:b w:val="false"/>
+                <w:bCs w:val="false"/>
+                <w:color w:val="000000"/>
+                <w:sz w:val="19"/>
+                <w:szCs w:val="19"/>
+              </w:rPr>
+              <w:t xml:space="preserve">219</w:t>
+            </w:r>
+          </w:p>
+        </w:tc>
+        <w:tc>
+          <w:tcPr>
+            <w:tcW w:type="dxa" w:w="2051"/>
+            <w:tcMar>
+              <w:top w:type="dxa" w:w="60"/>
+              <w:left w:type="dxa" w:w="100"/>
+              <w:bottom w:type="dxa" w:w="60"/>
+              <w:right w:type="dxa" w:w="100"/>
+            </w:tcMar>
+          </w:tcPr>
+          <w:p>
+            <w:pPr>
+              <w:spacing w:after="0" w:line="252"/>
+            </w:pPr>
+            <w:r>
+              <w:rPr>
+                <w:b w:val="false"/>
+                <w:bCs w:val="false"/>
+                <w:color w:val="000000"/>
+                <w:sz w:val="19"/>
+                <w:szCs w:val="19"/>
+              </w:rPr>
+              <w:t xml:space="preserve">13</w:t>
+            </w:r>
+          </w:p>
+        </w:tc>
+        <w:tc>
+          <w:tcPr>
+            <w:tcW w:type="dxa" w:w="2051"/>
+            <w:tcMar>
+              <w:top w:type="dxa" w:w="60"/>
+              <w:left w:type="dxa" w:w="100"/>
+              <w:bottom w:type="dxa" w:w="60"/>
+              <w:right w:type="dxa" w:w="100"/>
+            </w:tcMar>
+          </w:tcPr>
+          <w:p>
+            <w:pPr>
+              <w:spacing w:after="0" w:line="252"/>
+            </w:pPr>
+            <w:r>
+              <w:rPr>
+                <w:b w:val="false"/>
+                <w:bCs w:val="false"/>
+                <w:color w:val="000000"/>
+                <w:sz w:val="19"/>
+                <w:szCs w:val="19"/>
+              </w:rPr>
+              <w:t xml:space="preserve">36</w:t>
+            </w:r>
+          </w:p>
+        </w:tc>
+      </w:tr>
+      <w:tr>
+        <w:tc>
+          <w:tcPr>
+            <w:tcW w:type="dxa" w:w="1231"/>
             <w:tcMar>
               <w:top w:type="dxa" w:w="60"/>
               <w:left w:type="dxa" w:w="100"/>
@@ -3024,53 +4143,105 @@
         </w:tc>
         <w:tc>
           <w:tcPr>
-            <w:tcW w:type="dxa" w:w="3610"/>
-            <w:tcMar>
-              <w:top w:type="dxa" w:w="60"/>
-              <w:left w:type="dxa" w:w="100"/>
-              <w:bottom w:type="dxa" w:w="60"/>
-              <w:right w:type="dxa" w:w="100"/>
-            </w:tcMar>
-          </w:tcPr>
-          <w:p>
-            <w:pPr>
-              <w:spacing w:after="0" w:line="252"/>
-            </w:pPr>
-            <w:r>
-              <w:rPr>
-                <w:b w:val="false"/>
-                <w:bCs w:val="false"/>
-                <w:color w:val="000000"/>
-                <w:sz w:val="19"/>
-                <w:szCs w:val="19"/>
-              </w:rPr>
-              <w:t xml:space="preserve">199 of 258</w:t>
-            </w:r>
-          </w:p>
-        </w:tc>
-        <w:tc>
-          <w:tcPr>
-            <w:tcW w:type="dxa" w:w="3610"/>
-            <w:tcMar>
-              <w:top w:type="dxa" w:w="60"/>
-              <w:left w:type="dxa" w:w="100"/>
-              <w:bottom w:type="dxa" w:w="60"/>
-              <w:right w:type="dxa" w:w="100"/>
-            </w:tcMar>
-          </w:tcPr>
-          <w:p>
-            <w:pPr>
-              <w:spacing w:after="0" w:line="252"/>
-            </w:pPr>
-            <w:r>
-              <w:rPr>
-                <w:b w:val="false"/>
-                <w:bCs w:val="false"/>
-                <w:color w:val="000000"/>
-                <w:sz w:val="19"/>
-                <w:szCs w:val="19"/>
-              </w:rPr>
-              <w:t xml:space="preserve">172 of 258</w:t>
+            <w:tcW w:type="dxa" w:w="1641"/>
+            <w:tcMar>
+              <w:top w:type="dxa" w:w="60"/>
+              <w:left w:type="dxa" w:w="100"/>
+              <w:bottom w:type="dxa" w:w="60"/>
+              <w:right w:type="dxa" w:w="100"/>
+            </w:tcMar>
+          </w:tcPr>
+          <w:p>
+            <w:pPr>
+              <w:spacing w:after="0" w:line="252"/>
+            </w:pPr>
+            <w:r>
+              <w:rPr>
+                <w:b w:val="false"/>
+                <w:bCs w:val="false"/>
+                <w:color w:val="000000"/>
+                <w:sz w:val="19"/>
+                <w:szCs w:val="19"/>
+              </w:rPr>
+              <w:t xml:space="preserve">261</w:t>
+            </w:r>
+          </w:p>
+        </w:tc>
+        <w:tc>
+          <w:tcPr>
+            <w:tcW w:type="dxa" w:w="2051"/>
+            <w:tcMar>
+              <w:top w:type="dxa" w:w="60"/>
+              <w:left w:type="dxa" w:w="100"/>
+              <w:bottom w:type="dxa" w:w="60"/>
+              <w:right w:type="dxa" w:w="100"/>
+            </w:tcMar>
+          </w:tcPr>
+          <w:p>
+            <w:pPr>
+              <w:spacing w:after="0" w:line="252"/>
+            </w:pPr>
+            <w:r>
+              <w:rPr>
+                <w:b w:val="false"/>
+                <w:bCs w:val="false"/>
+                <w:color w:val="000000"/>
+                <w:sz w:val="19"/>
+                <w:szCs w:val="19"/>
+              </w:rPr>
+              <w:t xml:space="preserve">201</w:t>
+            </w:r>
+          </w:p>
+        </w:tc>
+        <w:tc>
+          <w:tcPr>
+            <w:tcW w:type="dxa" w:w="2051"/>
+            <w:tcMar>
+              <w:top w:type="dxa" w:w="60"/>
+              <w:left w:type="dxa" w:w="100"/>
+              <w:bottom w:type="dxa" w:w="60"/>
+              <w:right w:type="dxa" w:w="100"/>
+            </w:tcMar>
+          </w:tcPr>
+          <w:p>
+            <w:pPr>
+              <w:spacing w:after="0" w:line="252"/>
+            </w:pPr>
+            <w:r>
+              <w:rPr>
+                <w:b w:val="false"/>
+                <w:bCs w:val="false"/>
+                <w:color w:val="000000"/>
+                <w:sz w:val="19"/>
+                <w:szCs w:val="19"/>
+              </w:rPr>
+              <w:t xml:space="preserve">11</w:t>
+            </w:r>
+          </w:p>
+        </w:tc>
+        <w:tc>
+          <w:tcPr>
+            <w:tcW w:type="dxa" w:w="2051"/>
+            <w:tcMar>
+              <w:top w:type="dxa" w:w="60"/>
+              <w:left w:type="dxa" w:w="100"/>
+              <w:bottom w:type="dxa" w:w="60"/>
+              <w:right w:type="dxa" w:w="100"/>
+            </w:tcMar>
+          </w:tcPr>
+          <w:p>
+            <w:pPr>
+              <w:spacing w:after="0" w:line="252"/>
+            </w:pPr>
+            <w:r>
+              <w:rPr>
+                <w:b w:val="false"/>
+                <w:bCs w:val="false"/>
+                <w:color w:val="000000"/>
+                <w:sz w:val="19"/>
+                <w:szCs w:val="19"/>
+              </w:rPr>
+              <w:t xml:space="preserve">49</w:t>
             </w:r>
           </w:p>
         </w:tc>
@@ -3080,6 +4251,18 @@
       <w:pPr>
         <w:spacing w:after="160"/>
       </w:pPr>
+    </w:p>
+    <w:p>
+      <w:pPr>
+        <w:spacing w:after="160" w:line="276"/>
+      </w:pPr>
+      <w:r>
+        <w:rPr>
+          <w:sz w:val="22"/>
+          <w:szCs w:val="22"/>
+        </w:rPr>
+        <w:t xml:space="preserve">86% of all specialisation-years are fully resolved at high or medium confidence; the unresolved remainder (mostly small ±6–24 credit gaps) carry the computed value at low confidence and are individually listed, with suggested actions, in validation/pending_adjudication_&lt;year&gt;.csv.</w:t>
+      </w:r>
     </w:p>
     <w:p>
       <w:pPr>
@@ -4436,7 +5619,7 @@
           <w:sz w:val="22"/>
           <w:szCs w:val="22"/>
         </w:rPr>
-        <w:t xml:space="preserve">If the software misread the page, report it — the parser is fixed and the year re-run (other years are provably unaffected).</w:t>
+        <w:t xml:space="preserve">If the software misread the page (the PDF prints the right value), the parser or its overrides file is fixed and the year re-run — other years are provably unaffected.</w:t>
       </w:r>
     </w:p>
     <w:p>
@@ -4453,7 +5636,28 @@
           <w:sz w:val="22"/>
           <w:szCs w:val="22"/>
         </w:rPr>
-        <w:t xml:space="preserve">If the handbook itself is wrong, the agreed correction is entered in the extractor's overrides file with the reason and page reference, and the pipeline re-run. Corrections are therefore visible, attributable, and reversible — the printed value is never silently replaced.</w:t>
+        <w:t xml:space="preserve">If the handbook itself is wrong or ambiguous, the decision is entered in the adjudication register (resolutions/com.csv) with its rationale and page evidence, and the final layer re-run. The as-printed record is never altered; the final tables carry the resolution with its register reference, so every correction is visible, attributable, and reversible.</w:t>
+      </w:r>
+    </w:p>
+    <w:p>
+      <w:pPr>
+        <w:spacing w:after="160" w:line="276"/>
+      </w:pPr>
+      <w:r>
+        <w:rPr>
+          <w:b/>
+          <w:bCs/>
+          <w:sz w:val="22"/>
+          <w:szCs w:val="22"/>
+        </w:rPr>
+        <w:t xml:space="preserve">Forty-four provisional adjudications </w:t>
+      </w:r>
+      <w:r>
+        <w:rPr>
+          <w:sz w:val="22"/>
+          <w:szCs w:val="22"/>
+        </w:rPr>
+        <w:t xml:space="preserve">(marked “provisional (Claude), pending review”) currently await confirmation — reviewing them is the most valuable contribution a reader of this manual can make. They are listed in resolutions/com.csv with their reasoning spelled out.</w:t>
       </w:r>
     </w:p>
     <w:p>
@@ -5261,6 +6465,114 @@
                 <w:sz w:val="19"/>
                 <w:szCs w:val="19"/>
               </w:rPr>
+              <w:t xml:space="preserve">data/processed/main_dataset_final.csv</w:t>
+            </w:r>
+          </w:p>
+        </w:tc>
+        <w:tc>
+          <w:tcPr>
+            <w:tcW w:type="dxa" w:w="4964"/>
+            <w:tcMar>
+              <w:top w:type="dxa" w:w="60"/>
+              <w:left w:type="dxa" w:w="100"/>
+              <w:bottom w:type="dxa" w:w="60"/>
+              <w:right w:type="dxa" w:w="100"/>
+            </w:tcMar>
+          </w:tcPr>
+          <w:p>
+            <w:pPr>
+              <w:spacing w:after="0" w:line="252"/>
+            </w:pPr>
+            <w:r>
+              <w:rPr>
+                <w:b w:val="false"/>
+                <w:bCs w:val="false"/>
+                <w:color w:val="000000"/>
+                <w:sz w:val="19"/>
+                <w:szCs w:val="19"/>
+              </w:rPr>
+              <w:t xml:space="preserve">the final-clean dataset — use this for analysis (section 6.4)</w:t>
+            </w:r>
+          </w:p>
+        </w:tc>
+      </w:tr>
+      <w:tr>
+        <w:tc>
+          <w:tcPr>
+            <w:tcW w:type="dxa" w:w="4062"/>
+            <w:tcMar>
+              <w:top w:type="dxa" w:w="60"/>
+              <w:left w:type="dxa" w:w="100"/>
+              <w:bottom w:type="dxa" w:w="60"/>
+              <w:right w:type="dxa" w:w="100"/>
+            </w:tcMar>
+          </w:tcPr>
+          <w:p>
+            <w:pPr>
+              <w:spacing w:after="0" w:line="252"/>
+            </w:pPr>
+            <w:r>
+              <w:rPr>
+                <w:b w:val="false"/>
+                <w:bCs w:val="false"/>
+                <w:color w:val="000000"/>
+                <w:sz w:val="19"/>
+                <w:szCs w:val="19"/>
+              </w:rPr>
+              <w:t xml:space="preserve">data/processed/ideal_student_summary_final.csv</w:t>
+            </w:r>
+          </w:p>
+        </w:tc>
+        <w:tc>
+          <w:tcPr>
+            <w:tcW w:type="dxa" w:w="4964"/>
+            <w:tcMar>
+              <w:top w:type="dxa" w:w="60"/>
+              <w:left w:type="dxa" w:w="100"/>
+              <w:bottom w:type="dxa" w:w="60"/>
+              <w:right w:type="dxa" w:w="100"/>
+            </w:tcMar>
+          </w:tcPr>
+          <w:p>
+            <w:pPr>
+              <w:spacing w:after="0" w:line="252"/>
+            </w:pPr>
+            <w:r>
+              <w:rPr>
+                <w:b w:val="false"/>
+                <w:bCs w:val="false"/>
+                <w:color w:val="000000"/>
+                <w:sz w:val="19"/>
+                <w:szCs w:val="19"/>
+              </w:rPr>
+              <w:t xml:space="preserve">final per specialisation-year roll-up (section 6.5)</w:t>
+            </w:r>
+          </w:p>
+        </w:tc>
+      </w:tr>
+      <w:tr>
+        <w:tc>
+          <w:tcPr>
+            <w:tcW w:type="dxa" w:w="4062"/>
+            <w:tcMar>
+              <w:top w:type="dxa" w:w="60"/>
+              <w:left w:type="dxa" w:w="100"/>
+              <w:bottom w:type="dxa" w:w="60"/>
+              <w:right w:type="dxa" w:w="100"/>
+            </w:tcMar>
+          </w:tcPr>
+          <w:p>
+            <w:pPr>
+              <w:spacing w:after="0" w:line="252"/>
+            </w:pPr>
+            <w:r>
+              <w:rPr>
+                <w:b w:val="false"/>
+                <w:bCs w:val="false"/>
+                <w:color w:val="000000"/>
+                <w:sz w:val="19"/>
+                <w:szCs w:val="19"/>
+              </w:rPr>
               <w:t xml:space="preserve">data/processed/main_dataset.csv</w:t>
             </w:r>
           </w:p>
@@ -5287,7 +6599,7 @@
                 <w:sz w:val="19"/>
                 <w:szCs w:val="19"/>
               </w:rPr>
-              <w:t xml:space="preserve">the single source of truth (section 6.1)</w:t>
+              <w:t xml:space="preserve">as-printed dataset (section 6.1) — audit/replication</w:t>
             </w:r>
           </w:p>
         </w:tc>
@@ -5315,7 +6627,7 @@
                 <w:sz w:val="19"/>
                 <w:szCs w:val="19"/>
               </w:rPr>
-              <w:t xml:space="preserve">data/processed/ideal_student_summary.csv</w:t>
+              <w:t xml:space="preserve">data/processed/*.csv</w:t>
             </w:r>
           </w:p>
         </w:tc>
@@ -5341,7 +6653,7 @@
                 <w:sz w:val="19"/>
                 <w:szCs w:val="19"/>
               </w:rPr>
-              <w:t xml:space="preserve">per specialisation-year roll-up (section 6.2)</w:t>
+              <w:t xml:space="preserve">as-printed roll-up and supporting tables (sections 6.2-6.3)</w:t>
             </w:r>
           </w:p>
         </w:tc>
@@ -5369,7 +6681,7 @@
                 <w:sz w:val="19"/>
                 <w:szCs w:val="19"/>
               </w:rPr>
-              <w:t xml:space="preserve">data/processed/*.csv</w:t>
+              <w:t xml:space="preserve">resolutions/com.csv</w:t>
             </w:r>
           </w:p>
         </w:tc>
@@ -5395,7 +6707,7 @@
                 <w:sz w:val="19"/>
                 <w:szCs w:val="19"/>
               </w:rPr>
-              <w:t xml:space="preserve">supporting tables (section 6.3)</w:t>
+              <w:t xml:space="preserve">the adjudication register with rationales (section 10)</w:t>
             </w:r>
           </w:p>
         </w:tc>
@@ -5449,7 +6761,61 @@
                 <w:sz w:val="19"/>
                 <w:szCs w:val="19"/>
               </w:rPr>
-              <w:t xml:space="preserve">per-year exception reports (section 7)</w:t>
+              <w:t xml:space="preserve">exception reports, resolution logs, pending adjudications (section 7)</w:t>
+            </w:r>
+          </w:p>
+        </w:tc>
+      </w:tr>
+      <w:tr>
+        <w:tc>
+          <w:tcPr>
+            <w:tcW w:type="dxa" w:w="4062"/>
+            <w:tcMar>
+              <w:top w:type="dxa" w:w="60"/>
+              <w:left w:type="dxa" w:w="100"/>
+              <w:bottom w:type="dxa" w:w="60"/>
+              <w:right w:type="dxa" w:w="100"/>
+            </w:tcMar>
+          </w:tcPr>
+          <w:p>
+            <w:pPr>
+              <w:spacing w:after="0" w:line="252"/>
+            </w:pPr>
+            <w:r>
+              <w:rPr>
+                <w:b w:val="false"/>
+                <w:bCs w:val="false"/>
+                <w:color w:val="000000"/>
+                <w:sz w:val="19"/>
+                <w:szCs w:val="19"/>
+              </w:rPr>
+              <w:t xml:space="preserve">docs/FINAL-DATASET-METHOD.md</w:t>
+            </w:r>
+          </w:p>
+        </w:tc>
+        <w:tc>
+          <w:tcPr>
+            <w:tcW w:type="dxa" w:w="4964"/>
+            <w:tcMar>
+              <w:top w:type="dxa" w:w="60"/>
+              <w:left w:type="dxa" w:w="100"/>
+              <w:bottom w:type="dxa" w:w="60"/>
+              <w:right w:type="dxa" w:w="100"/>
+            </w:tcMar>
+          </w:tcPr>
+          <w:p>
+            <w:pPr>
+              <w:spacing w:after="0" w:line="252"/>
+            </w:pPr>
+            <w:r>
+              <w:rPr>
+                <w:b w:val="false"/>
+                <w:bCs w:val="false"/>
+                <w:color w:val="000000"/>
+                <w:sz w:val="19"/>
+                <w:szCs w:val="19"/>
+              </w:rPr>
+              <w:t xml:space="preserve">how the final layer resolves discrepancies</w:t>
             </w:r>
           </w:p>
         </w:tc>

</xml_diff>